<commit_message>
Scale top 10 partner revenue + add revenue distribution chart
- Scale revenue/tokens/api_calls for S005-S010, S014 and supporting
  partners to strengthen top-10 contribution to portfolio metrics
- Boost S001/S002 Dec revenue to smooth seasonal dip
- Add Revenue Distribution section with Pareto (power law) and
  Histogram views as mode tabs below revenue share chart
- Use trailing 6-month average for QR/NDR computation for stability
- Reduce dev churn noise for star/strong/fine archetypes
- Portfolio QR: 1.5x, NDR: 101%, top 3 = 53% of revenue

Co-Authored-By: Claude Opus 4.6 (1M context) <noreply@anthropic.com>
</commit_message>
<xml_diff>
--- a/hex-dashboard-project/CASE-STUDIES-ANALYSIS.docx
+++ b/hex-dashboard-project/CASE-STUDIES-ANALYSIS.docx
@@ -280,6 +280,451 @@
           <w:szCs w:val="22"/>
         </w:rPr>
         <w:t xml:space="preserve">From these components we derive three key metrics:</w:t>
+      </w:r>
+    </w:p>
+    <w:p>
+      <w:pPr>
+        <w:spacing w:after="200" w:before="200"/>
+      </w:pPr>
+    </w:p>
+    <w:p>
+      <w:pPr>
+        <w:spacing w:after="40" w:before="80"/>
+      </w:pPr>
+      <w:r>
+        <w:rPr>
+          <w:rFonts w:ascii="Arial" w:cs="Arial" w:eastAsia="Arial" w:hAnsi="Arial"/>
+          <w:b/>
+          <w:bCs/>
+          <w:sz w:val="22"/>
+          <w:szCs w:val="22"/>
+        </w:rPr>
+        <w:t xml:space="preserve">Quick Ratio</w:t>
+      </w:r>
+    </w:p>
+    <w:p>
+      <w:pPr>
+        <w:pBdr>
+          <w:top w:val="none"/>
+          <w:bottom w:val="none"/>
+          <w:left w:val="single" w:color="3B82F6" w:sz="3" w:space="8"/>
+        </w:pBdr>
+        <w:spacing w:after="20" w:before="60"/>
+        <w:ind w:left="1440" w:right="1440"/>
+        <w:jc w:val="center"/>
+      </w:pPr>
+      <w:r>
+        <w:rPr>
+          <w:rFonts w:ascii="Cambria Math" w:cs="Cambria Math" w:eastAsia="Cambria Math" w:hAnsi="Cambria Math"/>
+          <w:color w:val="1E293B"/>
+          <w:sz w:val="22"/>
+          <w:szCs w:val="22"/>
+        </w:rPr>
+        <w:t xml:space="preserve">New  +  Resurrected  +  Expansion</w:t>
+      </w:r>
+    </w:p>
+    <w:p>
+      <w:pPr>
+        <w:spacing w:after="0" w:before="0"/>
+        <w:ind w:left="1440" w:right="1440"/>
+        <w:jc w:val="center"/>
+      </w:pPr>
+      <w:r>
+        <w:rPr>
+          <w:rFonts w:ascii="Cambria Math" w:cs="Cambria Math" w:eastAsia="Cambria Math" w:hAnsi="Cambria Math"/>
+          <w:color w:val="94A3B8"/>
+          <w:sz w:val="18"/>
+          <w:szCs w:val="18"/>
+        </w:rPr>
+        <w:t xml:space="preserve">──────────────────────────────────</w:t>
+      </w:r>
+    </w:p>
+    <w:p>
+      <w:pPr>
+        <w:pBdr>
+          <w:top w:val="none"/>
+          <w:bottom w:val="none"/>
+          <w:left w:val="single" w:color="3B82F6" w:sz="3" w:space="8"/>
+        </w:pBdr>
+        <w:spacing w:after="40" w:before="0"/>
+        <w:ind w:left="1440" w:right="1440"/>
+        <w:jc w:val="center"/>
+      </w:pPr>
+      <w:r>
+        <w:rPr>
+          <w:rFonts w:ascii="Cambria Math" w:cs="Cambria Math" w:eastAsia="Cambria Math" w:hAnsi="Cambria Math"/>
+          <w:color w:val="1E293B"/>
+          <w:sz w:val="22"/>
+          <w:szCs w:val="22"/>
+        </w:rPr>
+        <w:t xml:space="preserve">Churned  +  Contraction</w:t>
+      </w:r>
+    </w:p>
+    <w:p>
+      <w:pPr>
+        <w:spacing w:after="160"/>
+        <w:ind w:left="360"/>
+      </w:pPr>
+      <w:r>
+        <w:rPr>
+          <w:rFonts w:ascii="Arial" w:cs="Arial" w:eastAsia="Arial" w:hAnsi="Arial"/>
+          <w:i/>
+          <w:iCs/>
+          <w:color w:val="64748B"/>
+          <w:sz w:val="20"/>
+          <w:szCs w:val="20"/>
+        </w:rPr>
+        <w:t xml:space="preserve">Measures growth efficiency. How many units gained for every unit lost. &gt;4x = very healthy, &lt;1x = shrinking.</w:t>
+      </w:r>
+    </w:p>
+    <w:p>
+      <w:pPr>
+        <w:spacing w:after="40" w:before="80"/>
+      </w:pPr>
+      <w:r>
+        <w:rPr>
+          <w:rFonts w:ascii="Arial" w:cs="Arial" w:eastAsia="Arial" w:hAnsi="Arial"/>
+          <w:b/>
+          <w:bCs/>
+          <w:sz w:val="22"/>
+          <w:szCs w:val="22"/>
+        </w:rPr>
+        <w:t xml:space="preserve">Gross Dollar Retention (GDR)</w:t>
+      </w:r>
+    </w:p>
+    <w:p>
+      <w:pPr>
+        <w:pBdr>
+          <w:top w:val="none"/>
+          <w:bottom w:val="none"/>
+          <w:left w:val="single" w:color="16A34A" w:sz="3" w:space="8"/>
+        </w:pBdr>
+        <w:spacing w:after="20" w:before="60"/>
+        <w:ind w:left="1440" w:right="1440"/>
+        <w:jc w:val="center"/>
+      </w:pPr>
+      <w:r>
+        <w:rPr>
+          <w:rFonts w:ascii="Cambria Math" w:cs="Cambria Math" w:eastAsia="Cambria Math" w:hAnsi="Cambria Math"/>
+          <w:color w:val="1E293B"/>
+          <w:sz w:val="22"/>
+          <w:szCs w:val="22"/>
+        </w:rPr>
+        <w:t xml:space="preserve">Retained Revenue</w:t>
+      </w:r>
+    </w:p>
+    <w:p>
+      <w:pPr>
+        <w:spacing w:after="0" w:before="0"/>
+        <w:ind w:left="1440" w:right="1440"/>
+        <w:jc w:val="center"/>
+      </w:pPr>
+      <w:r>
+        <w:rPr>
+          <w:rFonts w:ascii="Cambria Math" w:cs="Cambria Math" w:eastAsia="Cambria Math" w:hAnsi="Cambria Math"/>
+          <w:color w:val="94A3B8"/>
+          <w:sz w:val="18"/>
+          <w:szCs w:val="18"/>
+        </w:rPr>
+        <w:t xml:space="preserve">──────────────────────────────────</w:t>
+      </w:r>
+    </w:p>
+    <w:p>
+      <w:pPr>
+        <w:pBdr>
+          <w:top w:val="none"/>
+          <w:bottom w:val="none"/>
+          <w:left w:val="single" w:color="16A34A" w:sz="3" w:space="8"/>
+        </w:pBdr>
+        <w:spacing w:after="40" w:before="0"/>
+        <w:ind w:left="1440" w:right="1440"/>
+        <w:jc w:val="center"/>
+      </w:pPr>
+      <w:r>
+        <w:rPr>
+          <w:rFonts w:ascii="Cambria Math" w:cs="Cambria Math" w:eastAsia="Cambria Math" w:hAnsi="Cambria Math"/>
+          <w:color w:val="1E293B"/>
+          <w:sz w:val="22"/>
+          <w:szCs w:val="22"/>
+        </w:rPr>
+        <w:t xml:space="preserve">Prior Period Revenue</w:t>
+      </w:r>
+    </w:p>
+    <w:p>
+      <w:pPr>
+        <w:spacing w:after="160"/>
+        <w:ind w:left="360"/>
+      </w:pPr>
+      <w:r>
+        <w:rPr>
+          <w:rFonts w:ascii="Arial" w:cs="Arial" w:eastAsia="Arial" w:hAnsi="Arial"/>
+          <w:i/>
+          <w:iCs/>
+          <w:color w:val="64748B"/>
+          <w:sz w:val="20"/>
+          <w:szCs w:val="20"/>
+        </w:rPr>
+        <w:t xml:space="preserve">The floor — how much revenue survives month-to-month without any new business. Caps at 100%. B2B SaaS median: 91%.</w:t>
+      </w:r>
+    </w:p>
+    <w:p>
+      <w:pPr>
+        <w:spacing w:after="40" w:before="80"/>
+      </w:pPr>
+      <w:r>
+        <w:rPr>
+          <w:rFonts w:ascii="Arial" w:cs="Arial" w:eastAsia="Arial" w:hAnsi="Arial"/>
+          <w:b/>
+          <w:bCs/>
+          <w:sz w:val="22"/>
+          <w:szCs w:val="22"/>
+        </w:rPr>
+        <w:t xml:space="preserve">Net Dollar Retention (NDR)</w:t>
+      </w:r>
+    </w:p>
+    <w:p>
+      <w:pPr>
+        <w:pBdr>
+          <w:top w:val="none"/>
+          <w:bottom w:val="none"/>
+          <w:left w:val="single" w:color="D97706" w:sz="3" w:space="8"/>
+        </w:pBdr>
+        <w:spacing w:after="20" w:before="60"/>
+        <w:ind w:left="1440" w:right="1440"/>
+        <w:jc w:val="center"/>
+      </w:pPr>
+      <w:r>
+        <w:rPr>
+          <w:rFonts w:ascii="Cambria Math" w:cs="Cambria Math" w:eastAsia="Cambria Math" w:hAnsi="Cambria Math"/>
+          <w:color w:val="1E293B"/>
+          <w:sz w:val="22"/>
+          <w:szCs w:val="22"/>
+        </w:rPr>
+        <w:t xml:space="preserve">Retained  +  Expansion  +  Resurrected</w:t>
+      </w:r>
+    </w:p>
+    <w:p>
+      <w:pPr>
+        <w:spacing w:after="0" w:before="0"/>
+        <w:ind w:left="1440" w:right="1440"/>
+        <w:jc w:val="center"/>
+      </w:pPr>
+      <w:r>
+        <w:rPr>
+          <w:rFonts w:ascii="Cambria Math" w:cs="Cambria Math" w:eastAsia="Cambria Math" w:hAnsi="Cambria Math"/>
+          <w:color w:val="94A3B8"/>
+          <w:sz w:val="18"/>
+          <w:szCs w:val="18"/>
+        </w:rPr>
+        <w:t xml:space="preserve">──────────────────────────────────</w:t>
+      </w:r>
+    </w:p>
+    <w:p>
+      <w:pPr>
+        <w:pBdr>
+          <w:top w:val="none"/>
+          <w:bottom w:val="none"/>
+          <w:left w:val="single" w:color="D97706" w:sz="3" w:space="8"/>
+        </w:pBdr>
+        <w:spacing w:after="40" w:before="0"/>
+        <w:ind w:left="1440" w:right="1440"/>
+        <w:jc w:val="center"/>
+      </w:pPr>
+      <w:r>
+        <w:rPr>
+          <w:rFonts w:ascii="Cambria Math" w:cs="Cambria Math" w:eastAsia="Cambria Math" w:hAnsi="Cambria Math"/>
+          <w:color w:val="1E293B"/>
+          <w:sz w:val="22"/>
+          <w:szCs w:val="22"/>
+        </w:rPr>
+        <w:t xml:space="preserve">Prior Period Revenue</w:t>
+      </w:r>
+    </w:p>
+    <w:p>
+      <w:pPr>
+        <w:spacing w:after="160"/>
+        <w:ind w:left="360"/>
+      </w:pPr>
+      <w:r>
+        <w:rPr>
+          <w:rFonts w:ascii="Arial" w:cs="Arial" w:eastAsia="Arial" w:hAnsi="Arial"/>
+          <w:i/>
+          <w:iCs/>
+          <w:color w:val="64748B"/>
+          <w:sz w:val="20"/>
+          <w:szCs w:val="20"/>
+        </w:rPr>
+        <w:t xml:space="preserve">Whether the existing base is growing or shrinking. &gt;100% = expansion exceeds losses (the goal). Enterprise B2B SaaS median: 110–118%.</w:t>
+      </w:r>
+    </w:p>
+    <w:p>
+      <w:pPr>
+        <w:spacing w:after="120"/>
+      </w:pPr>
+      <w:r>
+        <w:rPr>
+          <w:rFonts w:ascii="Arial" w:cs="Arial" w:eastAsia="Arial" w:hAnsi="Arial"/>
+          <w:sz w:val="22"/>
+          <w:szCs w:val="22"/>
+        </w:rPr>
+        <w:t xml:space="preserve">Critically, the same Quick Ratio can mean very different things depending on the partner’s use case. A consumer product with QR 2.0x (high churn offset by high new) is healthy. A B2B enterprise product with QR 2.0x (moderate churn, moderate new) may be concerning. The case studies below demonstrate this principle.</w:t>
+      </w:r>
+    </w:p>
+    <w:p>
+      <w:pPr>
+        <w:spacing w:after="200" w:before="200"/>
+      </w:pPr>
+    </w:p>
+    <w:p>
+      <w:pPr>
+        <w:pStyle w:val="Heading1"/>
+      </w:pPr>
+      <w:r>
+        <w:rPr>
+          <w:b/>
+          <w:bCs/>
+        </w:rPr>
+        <w:t xml:space="preserve">Pulse Section: Key Visualisations</w:t>
+      </w:r>
+    </w:p>
+    <w:p>
+      <w:pPr>
+        <w:pStyle w:val="Heading2"/>
+      </w:pPr>
+      <w:r>
+        <w:rPr>
+          <w:b/>
+          <w:bCs/>
+        </w:rPr>
+        <w:t xml:space="preserve">Compound Monthly Growth Rate (CMGR)</w:t>
+      </w:r>
+    </w:p>
+    <w:p>
+      <w:pPr>
+        <w:spacing w:after="120"/>
+      </w:pPr>
+      <w:r>
+        <w:rPr>
+          <w:rFonts w:ascii="Arial" w:cs="Arial" w:eastAsia="Arial" w:hAnsi="Arial"/>
+          <w:sz w:val="22"/>
+          <w:szCs w:val="22"/>
+        </w:rPr>
+        <w:t xml:space="preserve">CMGR measures the smoothed monthly growth rate over trailing windows — 3, 6, and 12 months. We show all three simultaneously because the relationship between them tells a story that no single number can.</w:t>
+      </w:r>
+    </w:p>
+    <w:p>
+      <w:pPr>
+        <w:spacing w:after="120"/>
+      </w:pPr>
+      <w:r>
+        <w:rPr>
+          <w:rFonts w:ascii="Arial" w:cs="Arial" w:eastAsia="Arial" w:hAnsi="Arial"/>
+          <w:sz w:val="22"/>
+          <w:szCs w:val="22"/>
+        </w:rPr>
+        <w:t xml:space="preserve">When CMGR-3 leads CMGR-12 (short-term growth exceeds long-term average), the portfolio is accelerating. When CMGR-3 trails CMGR-12, growth has decelerated — recent months are underperforming the historical trend. This spread is surfaced as an explicit callout in the Pulse section because it’s the earliest signal of a structural slowdown versus a seasonal dip.</w:t>
+      </w:r>
+    </w:p>
+    <w:p>
+      <w:pPr>
+        <w:spacing w:after="120"/>
+      </w:pPr>
+      <w:r>
+        <w:rPr>
+          <w:rFonts w:ascii="Arial" w:cs="Arial" w:eastAsia="Arial" w:hAnsi="Arial"/>
+          <w:sz w:val="22"/>
+          <w:szCs w:val="22"/>
+        </w:rPr>
+        <w:t xml:space="preserve">For a startup partnerships portfolio, CMGR is more useful than annualised CAGR because the time horizons are short (12–24 months of partner history) and the growth rates are volatile. A partner showing 1,500% CAGR from a $100 base is mathematically correct but operationally meaningless. CMGR-3 of 8% tells you they’re compounding steadily right now, which is actionable.</w:t>
+      </w:r>
+    </w:p>
+    <w:p>
+      <w:pPr>
+        <w:pStyle w:val="Heading2"/>
+      </w:pPr>
+      <w:r>
+        <w:rPr>
+          <w:b/>
+          <w:bCs/>
+        </w:rPr>
+        <w:t xml:space="preserve">Portfolio Revenue Share</w:t>
+      </w:r>
+    </w:p>
+    <w:p>
+      <w:pPr>
+        <w:spacing w:after="120"/>
+      </w:pPr>
+      <w:r>
+        <w:rPr>
+          <w:rFonts w:ascii="Arial" w:cs="Arial" w:eastAsia="Arial" w:hAnsi="Arial"/>
+          <w:sz w:val="22"/>
+          <w:szCs w:val="22"/>
+        </w:rPr>
+        <w:t xml:space="preserve">The stacked area chart shows each partner’s proportional share of total portfolio revenue over time. Partners below a significance threshold are grouped into “Others” to keep the visual clean — we care about who’s winning, not the long tail of minimal contributors.</w:t>
+      </w:r>
+    </w:p>
+    <w:p>
+      <w:pPr>
+        <w:spacing w:after="120"/>
+      </w:pPr>
+      <w:r>
+        <w:rPr>
+          <w:rFonts w:ascii="Arial" w:cs="Arial" w:eastAsia="Arial" w:hAnsi="Arial"/>
+          <w:sz w:val="22"/>
+          <w:szCs w:val="22"/>
+        </w:rPr>
+        <w:t xml:space="preserve">This view naturally surfaces the power law. In our synthetic portfolio, MedScribe AI, NovaMed AI, BrieflyAI, and Eigen Technologies emerge as the clear top performers, collectively accounting for the majority of portfolio revenue. The remaining partners contribute individually small amounts.</w:t>
+      </w:r>
+    </w:p>
+    <w:p>
+      <w:pPr>
+        <w:spacing w:after="120"/>
+      </w:pPr>
+      <w:r>
+        <w:rPr>
+          <w:rFonts w:ascii="Arial" w:cs="Arial" w:eastAsia="Arial" w:hAnsi="Arial"/>
+          <w:sz w:val="22"/>
+          <w:szCs w:val="22"/>
+        </w:rPr>
+        <w:t xml:space="preserve">The practical implication: these top performers are the candidates to watch most closely and allocate more resources to. Depending on internal policies and thresholds, they would be the first candidates to transition from the partnerships team to dedicated account management — or to hand over to account executives for deeper commercial relationships. They represent the portfolio’s future revenue base, and their retention is disproportionately important to the programme’s overall ROI.</w:t>
+      </w:r>
+    </w:p>
+    <w:p>
+      <w:pPr>
+        <w:spacing w:after="120"/>
+      </w:pPr>
+      <w:r>
+        <w:rPr>
+          <w:rFonts w:ascii="Arial" w:cs="Arial" w:eastAsia="Arial" w:hAnsi="Arial"/>
+          <w:sz w:val="22"/>
+          <w:szCs w:val="22"/>
+        </w:rPr>
+        <w:t xml:space="preserve">The “Others” band is equally informative. If it’s growing as a proportion, the portfolio is diversifying — more partners are contributing meaningfully. If it’s shrinking, concentration risk is increasing and the portfolio’s health depends on fewer bets.</w:t>
+      </w:r>
+    </w:p>
+    <w:p>
+      <w:pPr>
+        <w:pStyle w:val="Heading2"/>
+      </w:pPr>
+      <w:r>
+        <w:rPr>
+          <w:b/>
+          <w:bCs/>
+        </w:rPr>
+        <w:t xml:space="preserve">Revenue Distribution</w:t>
+      </w:r>
+    </w:p>
+    <w:p>
+      <w:pPr>
+        <w:spacing w:after="120"/>
+      </w:pPr>
+      <w:r>
+        <w:rPr>
+          <w:rFonts w:ascii="Arial" w:cs="Arial" w:eastAsia="Arial" w:hAnsi="Arial"/>
+          <w:sz w:val="22"/>
+          <w:szCs w:val="22"/>
+        </w:rPr>
+        <w:t xml:space="preserve">The revenue distribution chart shows the shape of revenue across the entire partner portfolio. Two views are provided:</w:t>
       </w:r>
     </w:p>
     <w:p>
@@ -297,7 +742,7 @@
           <w:sz w:val="22"/>
           <w:szCs w:val="22"/>
         </w:rPr>
-        <w:t xml:space="preserve">Quick Ratio = (New + Resurrected + Expansion) / (Churned + Contraction) — measures growth efficiency</w:t>
+        <w:t xml:space="preserve">Power Law / Pareto: a horizontal bar chart of each partner’s monthly revenue (sorted high to low) with a cumulative percentage line. This immediately reveals whether the portfolio follows a power law distribution — in a typical startup portfolio, the top 3–5 partners will generate 50–70% of total revenue.</w:t>
       </w:r>
     </w:p>
     <w:p>
@@ -315,25 +760,7 @@
           <w:sz w:val="22"/>
           <w:szCs w:val="22"/>
         </w:rPr>
-        <w:t xml:space="preserve">Gross Retention = Retained / Prior Revenue — the floor, how much survives without new business</w:t>
-      </w:r>
-    </w:p>
-    <w:p>
-      <w:pPr>
-        <w:pStyle w:val="ListParagraph"/>
-        <w:numPr>
-          <w:ilvl w:val="0"/>
-          <w:numId w:val="2"/>
-        </w:numPr>
-        <w:spacing w:after="60"/>
-      </w:pPr>
-      <w:r>
-        <w:rPr>
-          <w:rFonts w:ascii="Arial" w:cs="Arial" w:eastAsia="Arial" w:hAnsi="Arial"/>
-          <w:sz w:val="22"/>
-          <w:szCs w:val="22"/>
-        </w:rPr>
-        <w:t xml:space="preserve">Net Dollar Retention = (Retained + Expansion + Resurrected) / Prior Revenue — whether the existing base is growing or shrinking</w:t>
+        <w:t xml:space="preserve">Histogram: groups partners into revenue buckets ($0, $0–500, $500–2K, $2K–10K, $10K+) showing how many partners fall into each tier. A healthy portfolio has a few partners in the high buckets and a long tail of smaller ones — not a uniform distribution.</w:t>
       </w:r>
     </w:p>
     <w:p>
@@ -346,7 +773,7 @@
           <w:sz w:val="22"/>
           <w:szCs w:val="22"/>
         </w:rPr>
-        <w:t xml:space="preserve">Critically, the same Quick Ratio can mean very different things depending on the partner’s use case. A consumer product with QR 2.0x (high churn offset by high new) is healthy. A B2B enterprise product with QR 2.0x (moderate churn, moderate new) may be concerning. The case studies below demonstrate this principle.</w:t>
+        <w:t xml:space="preserve">This visualisation directly informs resource allocation. If your top 3 partners account for 65% of portfolio revenue, those relationships need disproportionate attention. If the distribution is flatter, the portfolio is more resilient but may lack breakout performers.</w:t>
       </w:r>
     </w:p>
     <w:p>

</xml_diff>